<commit_message>
Dodaj treść o kolekcjonerstwie broni do statutu (podstawa pozwolenia kolekcjonerskiego)
Co-authored-by: witapolinarski <witapolinarski@gmail.com>
</commit_message>
<xml_diff>
--- a/dokumenty/statut-stowarzyszenia-strzeleckiego-wzor.docx
+++ b/dokumenty/statut-stowarzyszenia-strzeleckiego-wzor.docx
@@ -32,7 +32,7 @@
           <w:i/>
           <w:sz w:val="19"/>
         </w:rPr>
-        <w:t>Wzór uproszczony — przygotowany na bazie struktury statutu Towarzystwa Miłośników Strzelectwa „Sagittarius” (Gogolin, KRS 0000591210), ograniczony do elementów wymaganych ustawą — Prawo o stowarzyszeniach oraz do zapisów, które ułatwiają bezproblemowe przyjęcie klubu do PZSS i uzyskanie licencji klubowej. Pola w nawiasach kwadratowych [...] należy uzupełnić przed uchwaleniem statutu.</w:t>
+        <w:t>Wzór uproszczony — przygotowany na bazie struktury statutu Towarzystwa Miłośników Strzelectwa „Sagittarius” (Gogolin, KRS 0000591210), ograniczony do elementów wymaganych ustawą — Prawo o stowarzyszeniach, a jednocześnie rozbudowany o zapisy, które: (1) ułatwiają bezproblemowe przyjęcie klubu do PZSS i uzyskanie licencji klubowej, oraz (2) nadają Stowarzyszeniu wyraźny charakter kolekcjonerski, dzięki czemu udokumentowane członkostwo w nim stanowi samodzielną, ustawową podstawę do uzyskania przez członka pozwolenia na broń do celów kolekcjonerskich. Pola w nawiasach kwadratowych [...] należy uzupełnić przed uchwaleniem statutu.</w:t>
       </w:r>
     </w:p>
     <w:p>
@@ -81,7 +81,7 @@
     </w:p>
     <w:p>
       <w:r>
-        <w:t>Stowarzyszenie jest dobrowolnym, samorządnym i trwałym zrzeszeniem o celach niezarobkowych, powołanym w szczególności dla rozwoju i upowszechniania sportu strzeleckiego oraz zrzeszania osób zainteresowanych strzelectwem.</w:t>
+        <w:t>Stowarzyszenie jest dobrowolnym, samorządnym i trwałym zrzeszeniem o celach niezarobkowych, powołanym w szczególności dla rozwoju i upowszechniania sportu strzeleckiego oraz kolekcjonerstwa broni, a także zrzeszania osób zainteresowanych strzelectwem i kolekcjonerstwem broni.</w:t>
       </w:r>
     </w:p>
     <w:p>
@@ -137,7 +137,7 @@
         <w:ind w:left="340"/>
       </w:pPr>
       <w:r>
-        <w:t>3. Stowarzyszenie działa na podstawie ustawy z dnia 7 kwietnia 1989 r. — Prawo o stowarzyszeniach, ustawy z dnia 25 czerwca 2010 r. o sporcie oraz niniejszego Statutu.</w:t>
+        <w:t>3. Stowarzyszenie działa na podstawie ustawy z dnia 7 kwietnia 1989 r. — Prawo o stowarzyszeniach, ustawy z dnia 25 czerwca 2010 r. o sporcie, ustawy z dnia 21 maja 1999 r. o broni i amunicji oraz niniejszego Statutu.</w:t>
       </w:r>
     </w:p>
     <w:p>
@@ -185,7 +185,7 @@
         <w:ind w:left="340"/>
       </w:pPr>
       <w:r>
-        <w:t>1. Działalność Stowarzyszenia opiera się na pracy społecznej jego członków.</w:t>
+        <w:t>1. Stowarzyszenie posiada charakter kolekcjonerski w rozumieniu art. 10 ust. 3 pkt 5 ustawy z dnia 21 maja 1999 r. o broni i amunicji.</w:t>
       </w:r>
     </w:p>
     <w:p>
@@ -193,7 +193,15 @@
         <w:ind w:left="340"/>
       </w:pPr>
       <w:r>
-        <w:t>2. Stowarzyszenie może zatrudniać pracowników, w tym do realizacji zadań statutowych, oraz zlecać wykonanie określonych zadań osobom trzecim.</w:t>
+        <w:t>2. Udokumentowane członkostwo w Stowarzyszeniu oraz czynny udział w jego działalności kolekcjonerskiej stanowią ważną przyczynę ubiegania się przez członka Stowarzyszenia o pozwolenie na broń do celów kolekcjonerskich, zgodnie z przepisami ustawy, o której mowa w ust. 1.</w:t>
+      </w:r>
+    </w:p>
+    <w:p>
+      <w:pPr>
+        <w:ind w:left="340"/>
+      </w:pPr>
+      <w:r>
+        <w:t>3. Zasady, tryb oraz wzór wydawania przez Stowarzyszenie zaświadczeń, o których mowa w ust. 2 oraz w § 10 pkt 7, określa Zarząd w drodze uchwały.</w:t>
       </w:r>
     </w:p>
     <w:p>
@@ -205,8 +213,32 @@
       </w:r>
     </w:p>
     <w:p>
+      <w:pPr>
+        <w:ind w:left="340"/>
+      </w:pPr>
       <w:r>
-        <w:t>Stowarzyszenie może posiadać własny znak graficzny, pieczęcie i odznaki oraz przyznawać wyróżnienia i nagrody osobom i podmiotom zasłużonym dla rozwoju Stowarzyszenia i strzelectwa sportowego.</w:t>
+        <w:t>1. Działalność Stowarzyszenia opiera się na pracy społecznej jego członków.</w:t>
+      </w:r>
+    </w:p>
+    <w:p>
+      <w:pPr>
+        <w:ind w:left="340"/>
+      </w:pPr>
+      <w:r>
+        <w:t>2. Stowarzyszenie może zatrudniać pracowników, w tym do realizacji zadań statutowych, oraz zlecać wykonanie określonych zadań osobom trzecim.</w:t>
+      </w:r>
+    </w:p>
+    <w:p>
+      <w:r>
+        <w:rPr>
+          <w:b/>
+        </w:rPr>
+        <w:t>§ 8</w:t>
+      </w:r>
+    </w:p>
+    <w:p>
+      <w:r>
+        <w:t>Stowarzyszenie może posiadać własny znak graficzny, pieczęcie i odznaki oraz przyznawać wyróżnienia i nagrody osobom i podmiotom zasłużonym dla rozwoju Stowarzyszenia, strzelectwa sportowego oraz kolekcjonerstwa broni.</w:t>
       </w:r>
     </w:p>
     <w:p>
@@ -226,7 +258,7 @@
         <w:rPr>
           <w:b/>
         </w:rPr>
-        <w:t>§ 8</w:t>
+        <w:t>§ 9</w:t>
       </w:r>
     </w:p>
     <w:p>
@@ -255,7 +287,7 @@
         <w:ind w:left="340"/>
       </w:pPr>
       <w:r>
-        <w:t>3. upowszechnianie bezpiecznego i zgodnego z prawem posługiwania się bronią palną;</w:t>
+        <w:t>3. upowszechnianie i rozwój kolekcjonerstwa broni palnej, broni białej oraz innych militariów, w tym broni historycznej i współczesnej;</w:t>
       </w:r>
     </w:p>
     <w:p>
@@ -263,7 +295,7 @@
         <w:ind w:left="340"/>
       </w:pPr>
       <w:r>
-        <w:t>4. propagowanie strzelectwa rekreacyjnego oraz zdrowego, aktywnego trybu życia;</w:t>
+        <w:t>4. gromadzenie wiedzy, dokumentowanie i ochrona dziedzictwa związanego z historią oręża oraz opieka nad zabytkami techniki wojskowej;</w:t>
       </w:r>
     </w:p>
     <w:p>
@@ -271,7 +303,7 @@
         <w:ind w:left="340"/>
       </w:pPr>
       <w:r>
-        <w:t>5. integracja środowiska strzeleckiego oraz współpraca ze szkołami, uczelniami, służbami mundurowymi i organizacjami o podobnych celach;</w:t>
+        <w:t>5. zrzeszanie osób zainteresowanych kolekcjonerstwem broni oraz wspieranie ich w legalnym, zgodnym z prawem gromadzeniu, dokumentowaniu i zabezpieczaniu kolekcji;</w:t>
       </w:r>
     </w:p>
     <w:p>
@@ -279,7 +311,7 @@
         <w:ind w:left="340"/>
       </w:pPr>
       <w:r>
-        <w:t>6. upowszechnianie wiedzy o broni, historii oręża oraz kolekcjonerstwie broni;</w:t>
+        <w:t>6. upowszechnianie bezpiecznego i zgodnego z prawem posługiwania się bronią palną oraz jej przechowywania;</w:t>
       </w:r>
     </w:p>
     <w:p>
@@ -287,7 +319,23 @@
         <w:ind w:left="340"/>
       </w:pPr>
       <w:r>
-        <w:t>7. działanie na rzecz obronności i bezpieczeństwa państwa oraz kształtowanie postaw patriotycznych i obywatelskich, w szczególności wśród dzieci i młodzieży.</w:t>
+        <w:t>7. propagowanie strzelectwa rekreacyjnego oraz zdrowego, aktywnego trybu życia;</w:t>
+      </w:r>
+    </w:p>
+    <w:p>
+      <w:pPr>
+        <w:ind w:left="340"/>
+      </w:pPr>
+      <w:r>
+        <w:t>8. integracja środowiska strzeleckiego i kolekcjonerskiego oraz współpraca ze szkołami, uczelniami, muzeami, instytucjami kultury, służbami mundurowymi i organizacjami o podobnych celach;</w:t>
+      </w:r>
+    </w:p>
+    <w:p>
+      <w:pPr>
+        <w:ind w:left="340"/>
+      </w:pPr>
+      <w:r>
+        <w:t>9. działanie na rzecz obronności i bezpieczeństwa państwa oraz kształtowanie postaw patriotycznych i obywatelskich, w szczególności wśród dzieci i młodzieży.</w:t>
       </w:r>
     </w:p>
     <w:p>
@@ -295,7 +343,7 @@
         <w:rPr>
           <w:b/>
         </w:rPr>
-        <w:t>§ 9</w:t>
+        <w:t>§ 10</w:t>
       </w:r>
     </w:p>
     <w:p>
@@ -324,7 +372,7 @@
         <w:ind w:left="340"/>
       </w:pPr>
       <w:r>
-        <w:t>3. prowadzenie, dzierżawę lub udostępnianie strzelnic oraz obiektów szkoleniowych spełniających wymogi regulaminowe PZSS;</w:t>
+        <w:t>3. organizowanie wystaw, pokazów, prelekcji i spotkań tematycznych poświęconych kolekcjonerstwu broni, militariów oraz historii uzbrojenia;</w:t>
       </w:r>
     </w:p>
     <w:p>
@@ -332,7 +380,7 @@
         <w:ind w:left="340"/>
       </w:pPr>
       <w:r>
-        <w:t>4. współpracę z PZSS, właściwym WZSS, jednostkami samorządu terytorialnego, szkołami oraz służbami mundurowymi;</w:t>
+        <w:t>4. prowadzenie, dzierżawę lub udostępnianie strzelnic oraz obiektów szkoleniowych spełniających wymogi regulaminowe PZSS;</w:t>
       </w:r>
     </w:p>
     <w:p>
@@ -340,7 +388,7 @@
         <w:ind w:left="340"/>
       </w:pPr>
       <w:r>
-        <w:t>5. prowadzenie ewidencji członków, klasyfikacji sportowej zawodników oraz dokumentacji wymaganej przepisami prawa i PZSS;</w:t>
+        <w:t>5. współpracę z PZSS, właściwym WZSS, muzeami i instytucjami kultury, jednostkami samorządu terytorialnego, szkołami oraz służbami mundurowymi;</w:t>
       </w:r>
     </w:p>
     <w:p>
@@ -348,7 +396,7 @@
         <w:ind w:left="340"/>
       </w:pPr>
       <w:r>
-        <w:t>6. pozyskiwanie środków na działalność statutową, w tym ze składek, darowizn, dotacji i sponsoringu;</w:t>
+        <w:t>6. prowadzenie ewidencji członków, dokumentowanie ich działalności kolekcjonerskiej, prowadzenie klasyfikacji sportowej zawodników oraz innej dokumentacji wymaganej przepisami prawa i PZSS;</w:t>
       </w:r>
     </w:p>
     <w:p>
@@ -356,7 +404,7 @@
         <w:ind w:left="340"/>
       </w:pPr>
       <w:r>
-        <w:t>7. prowadzenie działalności informacyjnej i wydawniczej w zakresie celów statutowych;</w:t>
+        <w:t>7. wydawanie członkom — na zasadach określonych w § 6 ust. 3 — zaświadczeń potwierdzających członkostwo oraz czynny udział w działalności statutowej Stowarzyszenia, w tym w działalności kolekcjonerskiej, w celu udokumentowania ważnej przyczyny posiadania broni, o której mowa w § 6 ust. 2;</w:t>
       </w:r>
     </w:p>
     <w:p>
@@ -364,7 +412,31 @@
         <w:ind w:left="340"/>
       </w:pPr>
       <w:r>
-        <w:t>8. podejmowanie innych działań sprzyjających realizacji celów Stowarzyszenia.</w:t>
+        <w:t>8. pozyskiwanie środków na działalność statutową, w tym ze składek, darowizn, dotacji i sponsoringu;</w:t>
+      </w:r>
+    </w:p>
+    <w:p>
+      <w:pPr>
+        <w:ind w:left="340"/>
+      </w:pPr>
+      <w:r>
+        <w:t>9. prowadzenie działalności informacyjnej i wydawniczej w zakresie celów statutowych;</w:t>
+      </w:r>
+    </w:p>
+    <w:p>
+      <w:pPr>
+        <w:ind w:left="340"/>
+      </w:pPr>
+      <w:r>
+        <w:t>10. powoływanie sekcji tematycznych, w tym sekcji strzeleckiej i sekcji kolekcjonerskiej, działających na podstawie regulaminów uchwalonych przez Zarząd;</w:t>
+      </w:r>
+    </w:p>
+    <w:p>
+      <w:pPr>
+        <w:ind w:left="340"/>
+      </w:pPr>
+      <w:r>
+        <w:t>11. podejmowanie innych działań sprzyjających realizacji celów Stowarzyszenia.</w:t>
       </w:r>
     </w:p>
     <w:p>
@@ -372,7 +444,7 @@
         <w:rPr>
           <w:b/>
         </w:rPr>
-        <w:t>§ 10</w:t>
+        <w:t>§ 11</w:t>
       </w:r>
     </w:p>
     <w:p>
@@ -397,7 +469,7 @@
         <w:rPr>
           <w:b/>
         </w:rPr>
-        <w:t>§ 11</w:t>
+        <w:t>§ 12</w:t>
       </w:r>
     </w:p>
     <w:p>
@@ -434,7 +506,7 @@
         <w:rPr>
           <w:b/>
         </w:rPr>
-        <w:t>§ 12</w:t>
+        <w:t>§ 13</w:t>
       </w:r>
     </w:p>
     <w:p>
@@ -450,7 +522,7 @@
         <w:ind w:left="680"/>
       </w:pPr>
       <w:r>
-        <w:t>1. posiada pełną zdolność do czynności prawnych i korzysta z pełni praw publicznych — w przypadku osób pełnoletnich, lub posiada ograniczoną zdolność do czynności prawnych — w przypadku małoletnich w wieku od 16 do 18 lat, z zastrzeżeniem § 13;</w:t>
+        <w:t>1. posiada pełną zdolność do czynności prawnych i korzysta z pełni praw publicznych — w przypadku osób pełnoletnich, lub posiada ograniczoną zdolność do czynności prawnych — w przypadku małoletnich w wieku od 16 do 18 lat, z zastrzeżeniem § 14;</w:t>
       </w:r>
     </w:p>
     <w:p>
@@ -458,7 +530,7 @@
         <w:ind w:left="680"/>
       </w:pPr>
       <w:r>
-        <w:t>2. jest zainteresowana strzelectwem sportowym i akceptuje cele Stowarzyszenia określone w niniejszym Statucie;</w:t>
+        <w:t>2. jest zainteresowana strzelectwem sportowym lub kolekcjonerstwem broni i akceptuje cele Stowarzyszenia określone w niniejszym Statucie;</w:t>
       </w:r>
     </w:p>
     <w:p>
@@ -490,7 +562,7 @@
         <w:rPr>
           <w:b/>
         </w:rPr>
-        <w:t>§ 13</w:t>
+        <w:t>§ 14</w:t>
       </w:r>
     </w:p>
     <w:p>
@@ -503,7 +575,7 @@
         <w:rPr>
           <w:b/>
         </w:rPr>
-        <w:t>§ 14</w:t>
+        <w:t>§ 15</w:t>
       </w:r>
     </w:p>
     <w:p>
@@ -519,7 +591,7 @@
         <w:ind w:left="340"/>
       </w:pPr>
       <w:r>
-        <w:t>2. Członkiem honorowym może zostać osoba szczególnie zasłużona dla Stowarzyszenia lub rozwoju strzelectwa sportowego; godność tę nadaje Walne Zebranie Członków na wniosek Zarządu.</w:t>
+        <w:t>2. Członkiem honorowym może zostać osoba szczególnie zasłużona dla Stowarzyszenia, rozwoju strzelectwa sportowego lub kolekcjonerstwa broni; godność tę nadaje Walne Zebranie Członków na wniosek Zarządu.</w:t>
       </w:r>
     </w:p>
     <w:p>
@@ -528,51 +600,6 @@
       </w:pPr>
       <w:r>
         <w:t>3. Członkowie wspierający i honorowi nie posiadają czynnego ani biernego prawa wyborczego, mogą jednak uczestniczyć w pracach władz Stowarzyszenia z głosem doradczym oraz korzystać z pozostałych praw członka zwyczajnego; są zwolnieni ze składek członkowskich.</w:t>
-      </w:r>
-    </w:p>
-    <w:p>
-      <w:r>
-        <w:rPr>
-          <w:b/>
-        </w:rPr>
-        <w:t>§ 15</w:t>
-      </w:r>
-    </w:p>
-    <w:p>
-      <w:r>
-        <w:t>Członkowie zwyczajni mają prawo do:</w:t>
-      </w:r>
-    </w:p>
-    <w:p>
-      <w:pPr>
-        <w:ind w:left="340"/>
-      </w:pPr>
-      <w:r>
-        <w:t>1. czynnego i biernego uczestnictwa w wyborach do władz Stowarzyszenia;</w:t>
-      </w:r>
-    </w:p>
-    <w:p>
-      <w:pPr>
-        <w:ind w:left="340"/>
-      </w:pPr>
-      <w:r>
-        <w:t>2. udziału w zawodach, szkoleniach i innych formach działalności statutowej;</w:t>
-      </w:r>
-    </w:p>
-    <w:p>
-      <w:pPr>
-        <w:ind w:left="340"/>
-      </w:pPr>
-      <w:r>
-        <w:t>3. korzystania z majątku i urządzeń Stowarzyszenia na zasadach określonych przez Zarząd;</w:t>
-      </w:r>
-    </w:p>
-    <w:p>
-      <w:pPr>
-        <w:ind w:left="340"/>
-      </w:pPr>
-      <w:r>
-        <w:t>4. zgłaszania wniosków dotyczących działalności Stowarzyszenia.</w:t>
       </w:r>
     </w:p>
     <w:p>
@@ -585,7 +612,7 @@
     </w:p>
     <w:p>
       <w:r>
-        <w:t>Członkowie zwyczajni mają obowiązek:</w:t>
+        <w:t>Członkowie zwyczajni mają prawo do:</w:t>
       </w:r>
     </w:p>
     <w:p>
@@ -593,7 +620,7 @@
         <w:ind w:left="340"/>
       </w:pPr>
       <w:r>
-        <w:t>1. przestrzegać Statutu, uchwał władz Stowarzyszenia oraz przepisów i regulaminów PZSS;</w:t>
+        <w:t>1. czynnego i biernego uczestnictwa w wyborach do władz Stowarzyszenia;</w:t>
       </w:r>
     </w:p>
     <w:p>
@@ -601,7 +628,7 @@
         <w:ind w:left="340"/>
       </w:pPr>
       <w:r>
-        <w:t>2. aktywnie uczestniczyć w realizacji celów Stowarzyszenia;</w:t>
+        <w:t>2. udziału w zawodach, szkoleniach i innych formach działalności statutowej, w tym w działalności sekcji kolekcjonerskiej;</w:t>
       </w:r>
     </w:p>
     <w:p>
@@ -609,7 +636,7 @@
         <w:ind w:left="340"/>
       </w:pPr>
       <w:r>
-        <w:t>3. terminowo opłacać składki członkowskie;</w:t>
+        <w:t>3. korzystania z majątku i urządzeń Stowarzyszenia na zasadach określonych przez Zarząd;</w:t>
       </w:r>
     </w:p>
     <w:p>
@@ -617,7 +644,15 @@
         <w:ind w:left="340"/>
       </w:pPr>
       <w:r>
-        <w:t>4. dbać o dobre imię Stowarzyszenia oraz przestrzegać zasad bezpiecznego posługiwania się bronią.</w:t>
+        <w:t>4. uzyskiwania zaświadczeń, o których mowa w § 10 pkt 7, potwierdzających członkostwo i czynny udział w działalności kolekcjonerskiej Stowarzyszenia;</w:t>
+      </w:r>
+    </w:p>
+    <w:p>
+      <w:pPr>
+        <w:ind w:left="340"/>
+      </w:pPr>
+      <w:r>
+        <w:t>5. zgłaszania wniosków dotyczących działalności Stowarzyszenia.</w:t>
       </w:r>
     </w:p>
     <w:p>
@@ -629,6 +664,51 @@
       </w:r>
     </w:p>
     <w:p>
+      <w:r>
+        <w:t>Członkowie zwyczajni mają obowiązek:</w:t>
+      </w:r>
+    </w:p>
+    <w:p>
+      <w:pPr>
+        <w:ind w:left="340"/>
+      </w:pPr>
+      <w:r>
+        <w:t>1. przestrzegać Statutu, uchwał władz Stowarzyszenia oraz przepisów i regulaminów PZSS;</w:t>
+      </w:r>
+    </w:p>
+    <w:p>
+      <w:pPr>
+        <w:ind w:left="340"/>
+      </w:pPr>
+      <w:r>
+        <w:t>2. aktywnie uczestniczyć w realizacji celów Stowarzyszenia;</w:t>
+      </w:r>
+    </w:p>
+    <w:p>
+      <w:pPr>
+        <w:ind w:left="340"/>
+      </w:pPr>
+      <w:r>
+        <w:t>3. terminowo opłacać składki członkowskie;</w:t>
+      </w:r>
+    </w:p>
+    <w:p>
+      <w:pPr>
+        <w:ind w:left="340"/>
+      </w:pPr>
+      <w:r>
+        <w:t>4. dbać o dobre imię Stowarzyszenia oraz przestrzegać zasad bezpiecznego posługiwania się bronią i jej przechowywania, w tym w ramach posiadanej kolekcji.</w:t>
+      </w:r>
+    </w:p>
+    <w:p>
+      <w:r>
+        <w:rPr>
+          <w:b/>
+        </w:rPr>
+        <w:t>§ 18</w:t>
+      </w:r>
+    </w:p>
+    <w:p>
       <w:pPr>
         <w:ind w:left="340"/>
       </w:pPr>
@@ -674,6 +754,14 @@
       </w:pPr>
       <w:r>
         <w:t>2. Od uchwały Zarządu o wykluczeniu przysługuje odwołanie do Walnego Zebrania Członków w terminie 14 dni; uchwała Walnego Zebrania jest ostateczna.</w:t>
+      </w:r>
+    </w:p>
+    <w:p>
+      <w:pPr>
+        <w:ind w:left="340"/>
+      </w:pPr>
+      <w:r>
+        <w:t>3. Utrata członkostwa powoduje utratę prawa do posługiwania się zaświadczeniami, o których mowa w § 10 pkt 7; Zarząd zawiadamia o tym fakcie właściwy organ Policji, jeżeli zaświadczenie takie posłużyło byłemu członkowi do uzyskania pozwolenia na broń.</w:t>
       </w:r>
     </w:p>
     <w:p>
@@ -693,7 +781,7 @@
         <w:rPr>
           <w:b/>
         </w:rPr>
-        <w:t>§ 18</w:t>
+        <w:t>§ 19</w:t>
       </w:r>
     </w:p>
     <w:p>
@@ -750,46 +838,6 @@
       </w:pPr>
       <w:r>
         <w:t>4. W razie zmniejszenia się składu Zarządu lub Komisji Rewizyjnej w trakcie kadencji, organy te mogą dokooptować nowych członków spośród członków zwyczajnych, w liczbie nieprzekraczającej 1/3 składu pochodzącego z wyboru.</w:t>
-      </w:r>
-    </w:p>
-    <w:p>
-      <w:r>
-        <w:rPr>
-          <w:b/>
-        </w:rPr>
-        <w:t>§ 19</w:t>
-      </w:r>
-    </w:p>
-    <w:p>
-      <w:pPr>
-        <w:ind w:left="340"/>
-      </w:pPr>
-      <w:r>
-        <w:t>1. Walne Zebranie Członków jest najwyższą władzą Stowarzyszenia.</w:t>
-      </w:r>
-    </w:p>
-    <w:p>
-      <w:pPr>
-        <w:ind w:left="340"/>
-      </w:pPr>
-      <w:r>
-        <w:t>2. Zwyczajne Walne Zebranie Członków zwołuje Zarząd co najmniej raz w roku, zawiadamiając członków o terminie, miejscu i porządku obrad co najmniej 14 dni wcześniej.</w:t>
-      </w:r>
-    </w:p>
-    <w:p>
-      <w:pPr>
-        <w:ind w:left="340"/>
-      </w:pPr>
-      <w:r>
-        <w:t>3. Nadzwyczajne Walne Zebranie Członków zwołuje Zarząd z własnej inicjatywy, na wniosek Komisji Rewizyjnej lub na pisemny wniosek co najmniej 1/3 członków zwyczajnych.</w:t>
-      </w:r>
-    </w:p>
-    <w:p>
-      <w:pPr>
-        <w:ind w:left="340"/>
-      </w:pPr>
-      <w:r>
-        <w:t>4. Do kompetencji Walnego Zebrania Członków należy w szczególności: uchwalanie kierunków działania Stowarzyszenia, zmian Statutu i regulaminów wewnętrznych, wybór i odwoływanie członków Zarządu i Komisji Rewizyjnej, udzielanie absolutorium Zarządowi, zatwierdzanie sprawozdań, ustalanie wysokości składek członkowskich oraz podejmowanie uchwały o rozwiązaniu Stowarzyszenia.</w:t>
       </w:r>
     </w:p>
     <w:p>
@@ -805,7 +853,7 @@
         <w:ind w:left="340"/>
       </w:pPr>
       <w:r>
-        <w:t>1. Zarząd kieruje bieżącą działalnością Stowarzyszenia i reprezentuje je na zewnątrz.</w:t>
+        <w:t>1. Walne Zebranie Członków jest najwyższą władzą Stowarzyszenia.</w:t>
       </w:r>
     </w:p>
     <w:p>
@@ -813,7 +861,7 @@
         <w:ind w:left="340"/>
       </w:pPr>
       <w:r>
-        <w:t>2. Zarząd składa się z 3 do 5 osób wybieranych przez Walne Zebranie Członków, które na pierwszym posiedzeniu wybierają spośród siebie prezesa, wiceprezesa i skarbnika.</w:t>
+        <w:t>2. Zwyczajne Walne Zebranie Członków zwołuje Zarząd co najmniej raz w roku, zawiadamiając członków o terminie, miejscu i porządku obrad co najmniej 14 dni wcześniej.</w:t>
       </w:r>
     </w:p>
     <w:p>
@@ -821,7 +869,7 @@
         <w:ind w:left="340"/>
       </w:pPr>
       <w:r>
-        <w:t>3. Do kompetencji Zarządu należy w szczególności: realizacja celów statutowych, kierowanie bieżącą działalnością, przyjmowanie i wykluczanie członków, zarządzanie majątkiem i finansami, zwoływanie Walnego Zebrania Członków, reprezentowanie Stowarzyszenia wobec PZSS i WZSS oraz składanie wymaganych sprawozdań.</w:t>
+        <w:t>3. Nadzwyczajne Walne Zebranie Członków zwołuje Zarząd z własnej inicjatywy, na wniosek Komisji Rewizyjnej lub na pisemny wniosek co najmniej 1/3 członków zwyczajnych.</w:t>
       </w:r>
     </w:p>
     <w:p>
@@ -829,7 +877,7 @@
         <w:ind w:left="340"/>
       </w:pPr>
       <w:r>
-        <w:t>4. Do składania oświadczeń woli w imieniu Stowarzyszenia, w tym w sprawach majątkowych, wymagane jest współdziałanie dwóch członków Zarządu, w tym prezesa lub upoważnionego wiceprezesa.</w:t>
+        <w:t>4. Do kompetencji Walnego Zebrania Członków należy w szczególności: uchwalanie kierunków działania Stowarzyszenia, zmian Statutu i regulaminów wewnętrznych, wybór i odwoływanie członków Zarządu i Komisji Rewizyjnej, udzielanie absolutorium Zarządowi, zatwierdzanie sprawozdań, ustalanie wysokości składek członkowskich oraz podejmowanie uchwały o rozwiązaniu Stowarzyszenia.</w:t>
       </w:r>
     </w:p>
     <w:p>
@@ -838,6 +886,46 @@
           <w:b/>
         </w:rPr>
         <w:t>§ 21</w:t>
+      </w:r>
+    </w:p>
+    <w:p>
+      <w:pPr>
+        <w:ind w:left="340"/>
+      </w:pPr>
+      <w:r>
+        <w:t>1. Zarząd kieruje bieżącą działalnością Stowarzyszenia i reprezentuje je na zewnątrz.</w:t>
+      </w:r>
+    </w:p>
+    <w:p>
+      <w:pPr>
+        <w:ind w:left="340"/>
+      </w:pPr>
+      <w:r>
+        <w:t>2. Zarząd składa się z 3 do 5 osób wybieranych przez Walne Zebranie Członków, które na pierwszym posiedzeniu wybierają spośród siebie prezesa, wiceprezesa i skarbnika.</w:t>
+      </w:r>
+    </w:p>
+    <w:p>
+      <w:pPr>
+        <w:ind w:left="340"/>
+      </w:pPr>
+      <w:r>
+        <w:t>3. Do kompetencji Zarządu należy w szczególności: realizacja celów statutowych, kierowanie bieżącą działalnością, przyjmowanie i wykluczanie członków, zarządzanie majątkiem i finansami, zwoływanie Walnego Zebrania Członków, reprezentowanie Stowarzyszenia wobec PZSS i WZSS, wydawanie zaświadczeń, o których mowa w § 10 pkt 7, dotyczących członkostwa i czynnego udziału w działalności kolekcjonerskiej Stowarzyszenia, a także składanie wymaganych sprawozdań.</w:t>
+      </w:r>
+    </w:p>
+    <w:p>
+      <w:pPr>
+        <w:ind w:left="340"/>
+      </w:pPr>
+      <w:r>
+        <w:t>4. Do składania oświadczeń woli w imieniu Stowarzyszenia, w tym w sprawach majątkowych, a także do podpisywania zaświadczeń, o których mowa w ust. 3, wymagane jest współdziałanie dwóch członków Zarządu, w tym prezesa lub upoważnionego wiceprezesa.</w:t>
+      </w:r>
+    </w:p>
+    <w:p>
+      <w:r>
+        <w:rPr>
+          <w:b/>
+        </w:rPr>
+        <w:t>§ 22</w:t>
       </w:r>
     </w:p>
     <w:p>
@@ -889,7 +977,7 @@
         <w:rPr>
           <w:b/>
         </w:rPr>
-        <w:t>§ 22</w:t>
+        <w:t>§ 23</w:t>
       </w:r>
     </w:p>
     <w:p>
@@ -941,7 +1029,7 @@
         <w:rPr>
           <w:b/>
         </w:rPr>
-        <w:t>§ 23</w:t>
+        <w:t>§ 24</w:t>
       </w:r>
     </w:p>
     <w:p>
@@ -954,7 +1042,7 @@
         <w:rPr>
           <w:b/>
         </w:rPr>
-        <w:t>§ 24</w:t>
+        <w:t>§ 25</w:t>
       </w:r>
     </w:p>
     <w:p>
@@ -967,12 +1055,12 @@
         <w:rPr>
           <w:b/>
         </w:rPr>
-        <w:t>§ 25</w:t>
+        <w:t>§ 26</w:t>
       </w:r>
     </w:p>
     <w:p>
       <w:r>
-        <w:t>W sprawach nieuregulowanych niniejszym Statutem zastosowanie mają przepisy powszechnie obowiązującego prawa, w szczególności ustawy — Prawo o stowarzyszeniach oraz ustawy o sporcie, a także statut i regulaminy Polskiego Związku Strzelectwa Sportowego w zakresie dotyczącym udziału Stowarzyszenia we współzawodnictwie sportowym.</w:t>
+        <w:t>W sprawach nieuregulowanych niniejszym Statutem zastosowanie mają przepisy powszechnie obowiązującego prawa, w szczególności ustawy — Prawo o stowarzyszeniach, ustawy o sporcie oraz ustawy o broni i amunicji w zakresie dotyczącym kolekcjonerstwa broni przez członków Stowarzyszenia, a także statut i regulaminy Polskiego Związku Strzelectwa Sportowego w zakresie dotyczącym udziału Stowarzyszenia we współzawodnictwie sportowym.</w:t>
       </w:r>
     </w:p>
     <w:p>
@@ -980,7 +1068,7 @@
         <w:rPr>
           <w:b/>
         </w:rPr>
-        <w:t>§ 26</w:t>
+        <w:t>§ 27</w:t>
       </w:r>
     </w:p>
     <w:p>
@@ -1322,7 +1410,7 @@
         <w:ind w:left="340"/>
       </w:pPr>
       <w:r>
-        <w:t>•  § 2, § 5 ust. 1, § 8 pkt 1–2 — jednoznacznie definiują Stowarzyszenie jako klub sportowy działający w dyscyplinie strzelectwo sportowe i wskazują udział we współzawodnictwie PZSS/WZSS jako cel statutowy (to kluczowy warunek uznania za „klub sportowy” w rozumieniu ustawy o sporcie).</w:t>
+        <w:t>•  § 2, § 5 ust. 1, § 9 pkt 1–2 — jednoznacznie definiują Stowarzyszenie jako klub sportowy działający w dyscyplinie strzelectwo sportowe i wskazują udział we współzawodnictwie PZSS/WZSS jako cel statutowy (to kluczowy warunek uznania za „klub sportowy” w rozumieniu ustawy o sporcie).</w:t>
       </w:r>
     </w:p>
     <w:p>
@@ -1355,6 +1443,14 @@
       </w:pPr>
       <w:r>
         <w:t>•  Nie zawiera żadnych postanowień sprzecznych ze statutem PZSS/WZSS (np. ograniczeń terytorialnych, zakazów przynależności do innych związków), co jest warunkiem przyjęcia w poczet członków Związku.</w:t>
+      </w:r>
+    </w:p>
+    <w:p>
+      <w:pPr>
+        <w:ind w:left="340"/>
+      </w:pPr>
+      <w:r>
+        <w:t>•  Dodanie celów kolekcjonerskich (§ 6, § 9 pkt 3–5) nie koliduje z wymogami PZSS — Związek ocenia wyłącznie, czy statut przewiduje działalność w sporcie strzeleckim; dodatkowe, równoległe cele statutowe (np. kolekcjonerstwo) są w pełni dopuszczalne i nie stanowią przesłanki odmowy licencji.</w:t>
       </w:r>
     </w:p>
     <w:p>
@@ -1480,6 +1576,90 @@
       </w:pPr>
       <w:r>
         <w:t>•  Alternatywą dla pełnej rejestracji w KRS jest uproszczony tryb z art. 4 ustawy o sporcie — wpis klubu sportowego (bez działalności gospodarczej) do ewidencji starosty właściwego dla siedziby klubu. PZSS honoruje taki wpis na równi z KRS (regulamin licencyjny dopuszcza „wypis z KRS lub innego rejestru albo ewidencji”), a wymogi co do treści statutu są analogiczne — ten wzór statutu nadaje się do obu ścieżek rejestracji.</w:t>
+      </w:r>
+    </w:p>
+    <w:p>
+      <w:pPr>
+        <w:jc w:val="center"/>
+      </w:pPr>
+      <w:r>
+        <w:rPr>
+          <w:b/>
+          <w:sz w:val="26"/>
+        </w:rPr>
+        <w:t>Dlaczego ten statut pomaga też uzyskać pozwolenie na broń do celów kolekcjonerskich</w:t>
+      </w:r>
+    </w:p>
+    <w:p>
+      <w:pPr>
+        <w:ind w:left="340"/>
+      </w:pPr>
+      <w:r>
+        <w:t>•  Zgodnie z art. 10 ust. 3 pkt 5 ustawy z dnia 21 maja 1999 r. o broni i amunicji, ważną przyczyną uzyskania pozwolenia na broń do celów kolekcjonerskich jest udokumentowane członkostwo w stowarzyszeniu o charakterze kolekcjonerskim — ustawa nie stawia tu żadnych dodatkowych warunków (w odróżnieniu np. od pozwolenia sportowego, które wymaga dodatkowo licencji zawodniczej i kwalifikacji sportowych).</w:t>
+      </w:r>
+    </w:p>
+    <w:p>
+      <w:pPr>
+        <w:ind w:left="340"/>
+      </w:pPr>
+      <w:r>
+        <w:t>•  § 6 statutu wprost stwierdza, że Stowarzyszenie ma charakter kolekcjonerski w rozumieniu tego przepisu, a udokumentowane członkostwo stanowi ważną przyczynę ubiegania się o pozwolenie kolekcjonerskie — członek nie musi więc niczego dodatkowo wywodzić ani interpretować z ogólnych celów statutowych.</w:t>
+      </w:r>
+    </w:p>
+    <w:p>
+      <w:pPr>
+        <w:ind w:left="340"/>
+      </w:pPr>
+      <w:r>
+        <w:t>•  Cele i sposoby działania (§ 9 pkt 3–5, § 10 pkt 3 i 6–7) opisują działalność kolekcjonerską jako realny, statutowy przedmiot działania Stowarzyszenia, a nie wzmiankę poboczną. Zgodnie z utrwalonym orzecznictwem sądów administracyjnych (np. wyrok WSA w Warszawie, sygn. II SA/Wa 1286/13) to właśnie treść statutu oraz wpis w rejestrze przesądzają o „charakterze kolekcjonerskim” stowarzyszenia — organ Policji nie jest uprawniony ani do oceny faktycznego dorobku kolekcjonerskiego klubu, ani do kwestionowania, czy sąd rejestrowy prawidłowo nadał mu taki charakter na podstawie statutu.</w:t>
+      </w:r>
+    </w:p>
+    <w:p>
+      <w:pPr>
+        <w:ind w:left="340"/>
+      </w:pPr>
+      <w:r>
+        <w:t>•  § 10 pkt 7 oraz § 21 ust. 3–4 upoważniają Zarząd do wydawania członkom — zgodnie z zasadami reprezentacji (podpisy dwóch członków Zarządu) — zaświadczeń potwierdzających członkostwo i czynny udział w działalności kolekcjonerskiej. To właśnie taki dokument, wraz z odpisem z KRS i statutem, członek dołącza do podania o pozwolenie na broń do celów kolekcjonerskich składanego w komendzie wojewódzkiej/stołecznej Policji (WPA).</w:t>
+      </w:r>
+    </w:p>
+    <w:p>
+      <w:r>
+        <w:rPr>
+          <w:b/>
+        </w:rPr>
+        <w:t>Co jeszcze warto zrobić po zarejestrowaniu Stowarzyszenia, dla pewności uzyskania pozwolenia kolekcjonerskiego przez członków</w:t>
+      </w:r>
+    </w:p>
+    <w:p>
+      <w:pPr>
+        <w:ind w:left="340"/>
+      </w:pPr>
+      <w:r>
+        <w:t>1. Przyjąć uchwałą Zarządu wzór zaświadczenia (upoważnienie do tego daje § 6 ust. 3) — zawierający dane członka, datę przyjęcia do Stowarzyszenia, informację o czynnym udziale w działalności kolekcjonerskiej (np. w sekcji kolekcjonerskiej) oraz podpisy dwóch członków Zarządu i pieczęć Stowarzyszenia.</w:t>
+      </w:r>
+    </w:p>
+    <w:p>
+      <w:pPr>
+        <w:ind w:left="340"/>
+      </w:pPr>
+      <w:r>
+        <w:t>2. Zadbać, by „przedmiot działalności” w KRS (kod PKD) obejmował kolekcjonerstwo — zwykle PKD 94.99.Z „Działalność pozostałych organizacji członkowskich, gdzie indziej niesklasyfikowana”, z opisem przedmiotu działalności w formularzu KRS-W wyraźnie wskazującym kolekcjonerstwo broni. To dodatkowo wzmacnia podstawę do wydania pozwolenia kolekcjonerskiego, zgodnie z cytowanym orzecznictwem opartym na danych rejestrowych.</w:t>
+      </w:r>
+    </w:p>
+    <w:p>
+      <w:pPr>
+        <w:ind w:left="340"/>
+      </w:pPr>
+      <w:r>
+        <w:t>3. Prowadzić realną działalność sekcji kolekcjonerskiej (spotkania, wystawy, dokumentacja zbiorów) i protokołować ją — mimo że formalnie Policja nie powinna oceniać dorobku, w praktyce udokumentowana aktywność ułatwia postępowanie i ogranicza ryzyko sporu.</w:t>
+      </w:r>
+    </w:p>
+    <w:p>
+      <w:pPr>
+        <w:ind w:left="340"/>
+      </w:pPr>
+      <w:r>
+        <w:t>4. Rozważyć uwzględnienie w pełnej nazwie Stowarzyszenia określenia wskazującego na charakter kolekcjonerski (np. „Stowarzyszenie Strzelecko-Kolekcjonerskie […]”) — nie jest to wymóg ustawowy (decyduje treść statutu, nie nazwa), ale ułatwia urzędnikom szybką kwalifikację wniosku przy pierwszym kontakcie.</w:t>
       </w:r>
     </w:p>
     <w:sectPr>

</xml_diff>

<commit_message>
Umożliw jednoosobową reprezentację Stowarzyszenia przez Prezesa Zarządu
Co-authored-by: witapolinarski <witapolinarski@gmail.com>
</commit_message>
<xml_diff>
--- a/dokumenty/statut-stowarzyszenia-strzeleckiego-wzor.docx
+++ b/dokumenty/statut-stowarzyszenia-strzeleckiego-wzor.docx
@@ -901,7 +901,7 @@
         <w:ind w:left="340"/>
       </w:pPr>
       <w:r>
-        <w:t>2. Zarząd składa się z 3 do 5 osób wybieranych przez Walne Zebranie Członków, które na pierwszym posiedzeniu wybierają spośród siebie prezesa, wiceprezesa i skarbnika.</w:t>
+        <w:t>2. Zarząd składa się z 1 do 5 osób wybieranych przez Walne Zebranie Członków. Jeżeli Zarząd jest wieloosobowy, na pierwszym posiedzeniu wybiera spośród siebie prezesa, a w razie potrzeby również wiceprezesa i skarbnika; jeżeli Walne Zebranie Członków wybierze Zarząd jednoosobowy, jego jedyny członek pełni funkcję Prezesa Zarządu.</w:t>
       </w:r>
     </w:p>
     <w:p>
@@ -917,7 +917,15 @@
         <w:ind w:left="340"/>
       </w:pPr>
       <w:r>
-        <w:t>4. Do składania oświadczeń woli w imieniu Stowarzyszenia, w tym w sprawach majątkowych, a także do podpisywania zaświadczeń, o których mowa w ust. 3, wymagane jest współdziałanie dwóch członków Zarządu, w tym prezesa lub upoważnionego wiceprezesa.</w:t>
+        <w:t>4. Do składania oświadczeń woli w imieniu Stowarzyszenia, w tym w sprawach majątkowych, a także do podpisywania zaświadczeń, o których mowa w ust. 3, uprawniony jest samodzielnie Prezes Zarządu. Pozostali (nie będący prezesem) członkowie Zarządu, jeżeli zostali powołani, reprezentują Stowarzyszenie w tym zakresie dwaj działający łącznie.</w:t>
+      </w:r>
+    </w:p>
+    <w:p>
+      <w:pPr>
+        <w:ind w:left="340"/>
+      </w:pPr>
+      <w:r>
+        <w:t>5. W przypadku, gdy funkcja Prezesa Zarządu pozostaje nieobsadzona lub Prezes Zarządu jest trwale niezdolny do pełnienia funkcji, Zarząd niezwłocznie wybiera spośród siebie nowego prezesa w trybie § 20 ust. 4; do czasu wyboru Stowarzyszenie reprezentuje dwóch członków Zarządu działających łącznie.</w:t>
       </w:r>
     </w:p>
     <w:p>
@@ -1580,6 +1588,14 @@
     </w:p>
     <w:p>
       <w:pPr>
+        <w:ind w:left="340"/>
+      </w:pPr>
+      <w:r>
+        <w:t>•  Reprezentacja jednoosobowa a dwuosobowa: ustawa — Prawo o stowarzyszeniach nie wymaga, by do reprezentowania stowarzyszenia lub zaciągania zobowiązań majątkowych potrzeba było dwóch podpisów, ani by w Zarządzie musiała zasiadać konkretna liczba osób czy funkcja „prezesa” — to w całości kwestia zapisów statutowych (art. 10 ust. 1 pkt 4–5 ustawy). Ten wzór przyjmuje rozwiązanie pośrednie: Prezes Zarządu działa samodzielnie (może sam podpisać umowę, otworzyć konto, złożyć oświadczenie do PZSS/WPA lub wydać zaświadczenie kolekcjonerskie), a pozostali członkowie Zarządu — jeśli zostali powołani — działają dwójkami. Zarząd może też być jednoosobowy (§ 21 ust. 2) — wtedy jedna osoba pełni funkcję Prezesa i reprezentuje Stowarzyszenie całkowicie samodzielnie we wszystkich sprawach, w tym majątkowych.</w:t>
+      </w:r>
+    </w:p>
+    <w:p>
+      <w:pPr>
         <w:jc w:val="center"/>
       </w:pPr>
       <w:r>
@@ -1619,7 +1635,7 @@
         <w:ind w:left="340"/>
       </w:pPr>
       <w:r>
-        <w:t>•  § 10 pkt 7 oraz § 21 ust. 3–4 upoważniają Zarząd do wydawania członkom — zgodnie z zasadami reprezentacji (podpisy dwóch członków Zarządu) — zaświadczeń potwierdzających członkostwo i czynny udział w działalności kolekcjonerskiej. To właśnie taki dokument, wraz z odpisem z KRS i statutem, członek dołącza do podania o pozwolenie na broń do celów kolekcjonerskich składanego w komendzie wojewódzkiej/stołecznej Policji (WPA).</w:t>
+        <w:t>•  § 10 pkt 7 oraz § 21 ust. 3–4 upoważniają Zarząd do wydawania członkom zaświadczeń potwierdzających członkostwo i czynny udział w działalności kolekcjonerskiej; zgodnie z przyjętymi zasadami reprezentacji może je podpisać samodzielnie Prezes Zarządu. To właśnie taki dokument, wraz z odpisem z KRS i statutem, członek dołącza do podania o pozwolenie na broń do celów kolekcjonerskich składanego w komendzie wojewódzkiej/stołecznej Policji (WPA).</w:t>
       </w:r>
     </w:p>
     <w:p>

</xml_diff>

<commit_message>
Ustaw bezterminową kadencję władz i popraw błędne odesłania w statucie
Co-authored-by: witapolinarski <witapolinarski@gmail.com>
</commit_message>
<xml_diff>
--- a/dokumenty/statut-stowarzyszenia-strzeleckiego-wzor.docx
+++ b/dokumenty/statut-stowarzyszenia-strzeleckiego-wzor.docx
@@ -821,7 +821,7 @@
         <w:ind w:left="340"/>
       </w:pPr>
       <w:r>
-        <w:t>2. Kadencja Zarządu i Komisji Rewizyjnej trwa [4] lata.</w:t>
+        <w:t>2. Kadencja Zarządu i Komisji Rewizyjnej jest bezterminowa — członek tych organów pełni swoją funkcję do czasu rezygnacji, odwołania przez Walne Zebranie Członków, utraty członkostwa w Stowarzyszeniu albo śmierci, bez konieczności dokonywania okresowych reelekcji.</w:t>
       </w:r>
     </w:p>
     <w:p>
@@ -829,7 +829,7 @@
         <w:ind w:left="340"/>
       </w:pPr>
       <w:r>
-        <w:t>3. Jeżeli Statut nie stanowi inaczej, uchwały władz Stowarzyszenia zapadają zwykłą większością głosów przy obecności co najmniej połowy uprawnionych do głosowania, w głosowaniu jawnym; wybory do władz odbywają się w głosowaniu tajnym.</w:t>
+        <w:t>3. Niezależnie od ust. 2, Walne Zebranie Członków może w każdym czasie odwołać Zarząd, Komisję Rewizyjną lub poszczególnych ich członków w drodze uchwały, na zasadach określonych w ust. 4.</w:t>
       </w:r>
     </w:p>
     <w:p>
@@ -837,7 +837,15 @@
         <w:ind w:left="340"/>
       </w:pPr>
       <w:r>
-        <w:t>4. W razie zmniejszenia się składu Zarządu lub Komisji Rewizyjnej w trakcie kadencji, organy te mogą dokooptować nowych członków spośród członków zwyczajnych, w liczbie nieprzekraczającej 1/3 składu pochodzącego z wyboru.</w:t>
+        <w:t>4. Jeżeli Statut nie stanowi inaczej, uchwały władz Stowarzyszenia zapadają zwykłą większością głosów przy obecności co najmniej połowy uprawnionych do głosowania, w głosowaniu jawnym; wybory do władz odbywają się w głosowaniu tajnym.</w:t>
+      </w:r>
+    </w:p>
+    <w:p>
+      <w:pPr>
+        <w:ind w:left="340"/>
+      </w:pPr>
+      <w:r>
+        <w:t>5. W razie zmniejszenia się składu Zarządu lub Komisji Rewizyjnej w wyniku rezygnacji, odwołania lub ustania członkostwa, organy te mogą dokooptować nowych członków spośród członków zwyczajnych, w liczbie nieprzekraczającej 1/3 dotychczasowego składu pochodzącego z wyboru; dokooptowani w ten sposób członkowie pełnią funkcję również bezterminowo, na zasadach ust. 2.</w:t>
       </w:r>
     </w:p>
     <w:p>
@@ -925,7 +933,7 @@
         <w:ind w:left="340"/>
       </w:pPr>
       <w:r>
-        <w:t>5. W przypadku, gdy funkcja Prezesa Zarządu pozostaje nieobsadzona lub Prezes Zarządu jest trwale niezdolny do pełnienia funkcji, Zarząd niezwłocznie wybiera spośród siebie nowego prezesa w trybie § 20 ust. 4; do czasu wyboru Stowarzyszenie reprezentuje dwóch członków Zarządu działających łącznie.</w:t>
+        <w:t>5. W przypadku, gdy funkcja Prezesa Zarządu pozostaje nieobsadzona lub Prezes Zarządu jest trwale niezdolny do pełnienia funkcji, Zarząd niezwłocznie wybiera spośród siebie nowego prezesa w trybie § 21 ust. 2; do czasu wyboru Stowarzyszenie reprezentuje dwóch członków Zarządu działających łącznie.</w:t>
       </w:r>
     </w:p>
     <w:p>
@@ -1591,6 +1599,14 @@
         <w:ind w:left="340"/>
       </w:pPr>
       <w:r>
+        <w:t>•  Kadencja władz: ustawa — Prawo o stowarzyszeniach nie określa ani minimalnej, ani maksymalnej długości kadencji Zarządu i Komisji Rewizyjnej — to w całości swoboda statutowa (może to być np. 2, 3, 4, 5 lat albo kadencja bezterminowa). Ten wzór przyjmuje rozwiązanie najdalej idące w kierunku stabilności: kadencja bezterminowa (§ 19 ust. 2) — władze nie muszą być cyklicznie wybierane na nowo, a pełnią funkcję do rezygnacji, odwołania lub ustania członkostwa. Walne Zebranie Członków zachowuje przy tym pełne prawo odwołania Zarządu lub Komisji Rewizyjnej w każdym czasie (§ 19 ust. 3), więc mechanizm demokratycznej kontroli nie znika — po prostu nie wymusza automatycznych reelekcji. Niezależnie od długości kadencji, każdą zmianę osobową we władzach trzeba zgłosić do KRS w terminie 7 dni od jej dokonania.</w:t>
+      </w:r>
+    </w:p>
+    <w:p>
+      <w:pPr>
+        <w:ind w:left="340"/>
+      </w:pPr>
+      <w:r>
         <w:t>•  Reprezentacja jednoosobowa a dwuosobowa: ustawa — Prawo o stowarzyszeniach nie wymaga, by do reprezentowania stowarzyszenia lub zaciągania zobowiązań majątkowych potrzeba było dwóch podpisów, ani by w Zarządzie musiała zasiadać konkretna liczba osób czy funkcja „prezesa” — to w całości kwestia zapisów statutowych (art. 10 ust. 1 pkt 4–5 ustawy). Ten wzór przyjmuje rozwiązanie pośrednie: Prezes Zarządu działa samodzielnie (może sam podpisać umowę, otworzyć konto, złożyć oświadczenie do PZSS/WPA lub wydać zaświadczenie kolekcjonerskie), a pozostali członkowie Zarządu — jeśli zostali powołani — działają dwójkami. Zarząd może też być jednoosobowy (§ 21 ust. 2) — wtedy jedna osoba pełni funkcję Prezesa i reprezentuje Stowarzyszenie całkowicie samodzielnie we wszystkich sprawach, w tym majątkowych.</w:t>
       </w:r>
     </w:p>

</xml_diff>

<commit_message>
Wprowadź podwyższony, kwalifikowany tryb odwołania Prezesa Zarządu
- Odwołanie Prezesa Zarządu wymaga odrębnej, podwyższonej procedury: wniosku
  Komisji Rewizyjnej lub co najmniej 1/2 ogółu członków, 30-dniowego
  wyprzedzenia z prawem Prezesa do wyjaśnień, oraz uchwały większością 3/4
  głosów liczoną od całego składu członkowskiego (nie tylko obecnych),
  bez ulgi kworum w drugim terminie (§19 ust. 4-5, §20 ust. 4 i 6-8)
- Komisja Rewizyjna (nie Prezes) zwołuje w tym wypadku Nadzwyczajne WZC,
  żeby Prezes nie mógł zablokować własnego odwołania (§20 ust. 7 pkt 2)
- Zamknięto furtkę obejścia ochrony przez zwykłą zmianę statutu części
  dotyczącej władz — wymaga tej samej kwalifikowanej większości (§20 ust. 9,
  §24)
- Dodano akapit wyjaśniający w sekcji 'Uwagi praktyczne' uzasadniający
  zgodność tego rozwiązania ze swobodą statutową i art. 11 ust. 1 Prawa
  o stowarzyszeniach

Co-authored-by: witapolinarski <witapolinarski@gmail.com>
</commit_message>
<xml_diff>
--- a/dokumenty/statut-stowarzyszenia-strzeleckiego-wzor.docx
+++ b/dokumenty/statut-stowarzyszenia-strzeleckiego-wzor.docx
@@ -837,7 +837,15 @@
         <w:ind w:left="340"/>
       </w:pPr>
       <w:r>
-        <w:t>4. Niezależnie od ust. 3, Walne Zebranie Członków może w każdym czasie odwołać Prezesa Zarządu, Komisję Rewizyjną lub jej poszczególnych członków w drodze uchwały, na zasadach określonych w § 20 ust. 5.</w:t>
+        <w:t>4. Niezależnie od ust. 3, Walne Zebranie Członków może w każdym czasie odwołać Komisję Rewizyjną lub jej poszczególnych członków w drodze uchwały podjętej na zasadach określonych w § 20 ust. 5.</w:t>
+      </w:r>
+    </w:p>
+    <w:p>
+      <w:pPr>
+        <w:ind w:left="340"/>
+      </w:pPr>
+      <w:r>
+        <w:t>5. Odwołanie Prezesa Zarządu jest możliwe wyłącznie w szczególnym, podwyższonym trybie określonym w § 20 ust. 7–9, którego celem jest zapewnienie stabilności jednoosobowego kierowania Stowarzyszeniem i maksymalne ograniczenie możliwości zmiany na tej funkcji wbrew woli większości ogółu członków.</w:t>
       </w:r>
     </w:p>
     <w:p>
@@ -877,7 +885,7 @@
         <w:ind w:left="340"/>
       </w:pPr>
       <w:r>
-        <w:t>4. Do wyłącznej kompetencji Walnego Zebrania Członków należy: uchwalanie zmian Statutu; wybór i odwoływanie Prezesa Zarządu oraz Komisji Rewizyjnej (jej członków); udzielanie Prezesowi Zarządu absolutorium; zatwierdzanie rocznego sprawozdania z działalności Stowarzyszenia; podjęcie uchwały o rozwiązaniu Stowarzyszenia i przeznaczeniu jego majątku. We wszystkich pozostałych sprawach, niezastrzeżonych niniejszym Statutem do wyłącznej kompetencji Walnego Zebrania Członków lub Komisji Rewizyjnej, decyzje podejmuje samodzielnie Prezes Zarządu.</w:t>
+        <w:t>4. Do wyłącznej kompetencji Walnego Zebrania Członków należy: uchwalanie zmian Statutu; wybór Prezesa Zarządu oraz wybór i odwoływanie Komisji Rewizyjnej (jej członków); odwoływanie Prezesa Zarządu — na zasadach szczególnych określonych w ust. 7–9; udzielanie Prezesowi Zarządu absolutorium; zatwierdzanie rocznego sprawozdania z działalności Stowarzyszenia; podjęcie uchwały o rozwiązaniu Stowarzyszenia i przeznaczeniu jego majątku. We wszystkich pozostałych sprawach, niezastrzeżonych niniejszym Statutem do wyłącznej kompetencji Walnego Zebrania Członków lub Komisji Rewizyjnej, decyzje podejmuje samodzielnie Prezes Zarządu.</w:t>
       </w:r>
     </w:p>
     <w:p>
@@ -893,7 +901,55 @@
         <w:ind w:left="340"/>
       </w:pPr>
       <w:r>
-        <w:t>6. Uchwały Walnego Zebrania Członków mogą być podejmowane w trybie uproszczonym — pisemnie albo przy wykorzystaniu środków komunikacji elektronicznej (w tym poczty elektronicznej lub wideokonferencji), bez konieczności odbywania zebrania w jednym miejscu i czasie — jeżeli wszyscy członkowie uprawnieni do głosowania wyrazili pisemną lub elektroniczną zgodę na głosowanie w tym trybie oraz na treść uchwały.</w:t>
+        <w:t>6. Uchwały Walnego Zebrania Członków mogą być podejmowane w trybie uproszczonym — pisemnie albo przy wykorzystaniu środków komunikacji elektronicznej (w tym poczty elektronicznej lub wideokonferencji), bez konieczności odbywania zebrania w jednym miejscu i czasie — jeżeli wszyscy członkowie uprawnieni do głosowania wyrazili pisemną lub elektroniczną zgodę na głosowanie w tym trybie oraz na treść uchwały; trybu uproszczonego nie stosuje się do uchwały o odwołaniu Prezesa Zarządu, o której mowa w ust. 7–9.</w:t>
+      </w:r>
+    </w:p>
+    <w:p>
+      <w:pPr>
+        <w:ind w:left="340"/>
+      </w:pPr>
+      <w:r>
+        <w:t>7. Odwołanie Prezesa Zarządu przed upływem jego funkcji wymaga łącznego spełnienia następujących warunków:</w:t>
+      </w:r>
+    </w:p>
+    <w:p>
+      <w:pPr>
+        <w:ind w:left="680"/>
+      </w:pPr>
+      <w:r>
+        <w:t>1. złożenia Przewodniczącemu Komisji Rewizyjnej pisemnego, uzasadnionego wniosku o odwołanie Prezesa Zarządu — przez Komisję Rewizyjną albo przez co najmniej połowę ogółu członków zwyczajnych uprawnionych do głosowania;</w:t>
+      </w:r>
+    </w:p>
+    <w:p>
+      <w:pPr>
+        <w:ind w:left="680"/>
+      </w:pPr>
+      <w:r>
+        <w:t>2. zwołania przez Komisję Rewizyjną — z wyłączeniem w tym zakresie kompetencji Prezesa Zarządu do zwoływania Walnego Zebrania Członków, o której mowa w ust. 2–3 — Nadzwyczajnego Walnego Zebrania Członków z odrębnym punktem porządku obrad dotyczącym odwołania Prezesa Zarządu; zawiadomienie o tym punkcie wraz z treścią wniosku i jego uzasadnieniem doręcza się wszystkim członkom co najmniej 30 dni przed terminem Zebrania, a Prezesowi Zarządu umożliwia się złożenie pisemnych lub ustnych wyjaśnień przed głosowaniem;</w:t>
+      </w:r>
+    </w:p>
+    <w:p>
+      <w:pPr>
+        <w:ind w:left="680"/>
+      </w:pPr>
+      <w:r>
+        <w:t>3. podjęcia uchwały o odwołaniu w głosowaniu tajnym większością co najmniej 3/4 głosów liczoną od ogółu członków zwyczajnych uprawnionych do głosowania, a nie tylko od osób obecnych na Zebraniu.</w:t>
+      </w:r>
+    </w:p>
+    <w:p>
+      <w:pPr>
+        <w:ind w:left="340"/>
+      </w:pPr>
+      <w:r>
+        <w:t>8. Do uchwały o odwołaniu Prezesa Zarządu nie stosuje się ust. 5 w zakresie dopuszczającym podjęcie uchwały w drugim terminie zwykłą większością głosów bez względu na liczbę obecnych — wymóg kworum i większości określony w ust. 7 pkt 3 obowiązuje niezależnie od terminu Zebrania, a nieuzyskanie wymaganej większości oznacza nieodwołanie Prezesa Zarządu.</w:t>
+      </w:r>
+    </w:p>
+    <w:p>
+      <w:pPr>
+        <w:ind w:left="340"/>
+      </w:pPr>
+      <w:r>
+        <w:t>9. Zasady określone w ust. 7–8 stosuje się odpowiednio do uchwały zmieniającej postanowienia Rozdziału IV Statutu (Władze Stowarzyszenia) w zakresie dotyczącym liczby, sposobu wyboru, kompetencji lub trybu odwołania Prezesa Zarządu — tak, aby ochrony przewidzianej w niniejszym paragrafie nie można było obejść w drodze zmiany Statutu podjętej na zasadach ogólnych określonych w § 24.</w:t>
       </w:r>
     </w:p>
     <w:p>
@@ -1066,7 +1122,7 @@
     </w:p>
     <w:p>
       <w:r>
-        <w:t>Uchwałę w sprawie zmiany Statutu oraz uchwałę o rozwiązaniu Stowarzyszenia podejmuje Walne Zebranie Członków większością 2/3 głosów przy obecności co najmniej połowy uprawnionych do głosowania.</w:t>
+        <w:t>Z zastrzeżeniem § 20 ust. 9, uchwałę w sprawie zmiany Statutu oraz uchwałę o rozwiązaniu Stowarzyszenia podejmuje Walne Zebranie Członków większością 2/3 głosów przy obecności co najmniej połowy uprawnionych do głosowania.</w:t>
       </w:r>
     </w:p>
     <w:p>
@@ -1623,7 +1679,7 @@
         <w:ind w:left="340"/>
       </w:pPr>
       <w:r>
-        <w:t>•  Kadencja władz: ustawa — Prawo o stowarzyszeniach nie określa ani minimalnej, ani maksymalnej długości kadencji Prezesa Zarządu i Komisji Rewizyjnej — to w całości swoboda statutowa. Ten wzór przyjmuje rozwiązanie najdalej idące w kierunku stabilności: kadencja bezterminowa (§ 19 ust. 3) — władze nie muszą być cyklicznie wybierane na nowo, a pełnią funkcję do rezygnacji, odwołania lub ustania członkostwa. Walne Zebranie Członków zachowuje przy tym pełne prawo odwołania Prezesa Zarządu lub Komisji Rewizyjnej w każdym czasie (§ 19 ust. 4). Niezależnie od długości kadencji, każdą zmianę osobową we władzach trzeba zgłosić do właściwego rejestru/ewidencji w terminie 7 dni od jej dokonania.</w:t>
+        <w:t>•  Kadencja władz: ustawa — Prawo o stowarzyszeniach nie określa ani minimalnej, ani maksymalnej długości kadencji Prezesa Zarządu i Komisji Rewizyjnej — to w całości swoboda statutowa. Ten wzór przyjmuje rozwiązanie najdalej idące w kierunku stabilności: kadencja bezterminowa (§ 19 ust. 3) — władze nie muszą być cyklicznie wybierane na nowo, a pełnią funkcję do rezygnacji, odwołania lub ustania członkostwa. Walne Zebranie Członków zachowuje przy tym prawo odwołania Komisji Rewizyjnej w każdym czasie na zasadach ogólnych (§ 19 ust. 4), a Prezesa Zarządu — w podwyższonym, znacznie trudniejszym do uruchomienia trybie opisanym niżej (§ 19 ust. 5, § 20 ust. 7–9). Niezależnie od długości kadencji, każdą zmianę osobową we władzach trzeba zgłosić do właściwego rejestru/ewidencji w terminie 7 dni od jej dokonania.</w:t>
       </w:r>
     </w:p>
     <w:p>
@@ -1632,6 +1688,14 @@
       </w:pPr>
       <w:r>
         <w:t>•  Pełnia władzy Prezesa: ustawa — Prawo o stowarzyszeniach wymaga tylko, by stowarzyszenie posiadało Walne Zebranie Członków (jako najwyższą władzę — art. 11 ust. 1) oraz odrębny organ kontroli wewnętrznej (art. 11 ust. 3); poza tym pozostawia pełną swobodę co do struktury i podziału kompetencji. Ten wzór wykorzystuje tę swobodę maksymalnie: Zarząd jest jednoosobowy i tożsamy z Prezesem (§ 19 ust. 2, § 21), który samodzielnie reprezentuje Stowarzyszenie i prowadzi wszystkie jego sprawy — w tym majątkowe — bez konieczności współdziałania z kimkolwiek innym (§ 21 ust. 2–3). Walne Zebranie Członków zachowuje wyłącznie te kompetencje, które muszą pozostać przy najwyższej władzy stowarzyszenia z mocy prawa lub dobrej praktyki (zmiana statutu, wybór/odwołanie Prezesa i Komisji Rewizyjnej, absolutorium, rozwiązanie Stowarzyszenia) — § 20 ust. 4 wprost oddaje Prezesowi wszystkie pozostałe sprawy. Dodatkowo uchwały Walnego Zebrania można podejmować w trybie uproszczonym, korespondencyjnie lub elektronicznie, bez zwoływania fizycznego zebrania (§ 20 ust. 6) — to ułatwia prowadzenie klubu nawet przy niewielkiej liczbie aktywnych członków.</w:t>
+      </w:r>
+    </w:p>
+    <w:p>
+      <w:pPr>
+        <w:ind w:left="340"/>
+      </w:pPr>
+      <w:r>
+        <w:t>•  Maksymalne ograniczenie zmiany na funkcji Prezesa: art. 11 ust. 1 Prawa o stowarzyszeniach czyni Walne Zebranie Członków najwyższą władzą, co w praktyce sądów rejestrowych oznacza, że statut nie może całkowicie odebrać mu prawa do odwołania Zarządu — taki zapis groziłby odmową wpisu jako sprzeczny z ustawą. Ten wzór tego prawa więc nie wyłącza, ale obwarowuje je najdalej idącymi, w pełni dozwolonymi w ramach swobody statutowej warunkami formalnymi (§ 20 ust. 7–9): wniosek o odwołanie musi pochodzić od Komisji Rewizyjnej albo od co najmniej połowy ogółu członków; wymaga 30-dniowego wyprzedzenia w zawiadomieniu o zebraniu oraz możliwości złożenia wyjaśnień przez Prezesa; a sama uchwała zapada większością 3/4 głosów liczoną od całego składu członkowskiego — nie tylko od osób obecnych na zebraniu — i to bez odstępstwa na wypadek niskiej frekwencji w drugim terminie. Tej samej, podwyższonej procedury wymaga również zmiana Statutu w części dotyczącej władz (§ 20 ust. 9, § 24), co zamyka furtkę obejścia tej ochrony poprzez zwykłą zmianę statutu zwykłą większością 2/3. W praktyce odwołanie Prezesa wymaga więc realnego, szerokiego konsensusu całej społeczności klubu, a nie tylko większości osób, które akurat przyszły na zebranie w drugim terminie.</w:t>
       </w:r>
     </w:p>
     <w:p>

</xml_diff>

<commit_message>
Wyrównaj opis rejestracji KRS i ewidencji starosty w statucie
- Przeformułowano wprowadzenie i sekcję 'Uwagi praktyczne dot. rejestracji',
  żeby KRS i ewidencja klubów sportowych prowadzona przez starostę były
  przedstawione jako dwie równoważne, w pełni dopuszczalne ścieżki rejestracji
  tego samego statutu, a nie jako tryb główny (ewidencja) i alternatywa (KRS)
- Dodano zdanie podsumowujące, że statut zawiera wszystkie elementy
  obowiązkowe z art. 10 ust. 1 Prawa o stowarzyszeniach, więc niezależnie od
  wybranej ścieżki organ rejestrowy nie powinien mieć podstaw do wezwania
  o uzupełnienie braków formalnych
- Celem zmiany jest spełnienie wymogu, żeby statut został przyjęty
  bezproblemowo i przez PZSS, i przez KRS (nie tylko przez uproszczoną
  ewidencję starosty)

Co-authored-by: witapolinarski <witapolinarski@gmail.com>
</commit_message>
<xml_diff>
--- a/dokumenty/statut-stowarzyszenia-strzeleckiego-wzor.docx
+++ b/dokumenty/statut-stowarzyszenia-strzeleckiego-wzor.docx
@@ -32,7 +32,7 @@
           <w:i/>
           <w:sz w:val="19"/>
         </w:rPr>
-        <w:t>Wzór uproszczony — przygotowany na bazie struktury statutu Towarzystwa Miłośników Strzelectwa „Sagittarius” (Gogolin, KRS 0000591210), ograniczony do elementów wymaganych ustawą — Prawo o stowarzyszeniach, a jednocześnie rozbudowany o zapisy, które: (1) ułatwiają bezproblemowe przyjęcie klubu do PZSS i uzyskanie licencji klubowej, (2) nadają Stowarzyszeniu wyraźny charakter kolekcjonerski, dzięki czemu udokumentowane członkostwo w nim stanowi samodzielną, ustawową podstawę do uzyskania przez członka pozwolenia na broń do celów kolekcjonerskich, oraz (3) maksymalnie upraszczają zarządzanie: Stowarzyszenie nie prowadzi działalności gospodarczej (co pozwala zarejestrować je w uproszczonym trybie ewidencji starosty, zamiast w KRS), a pełnię bieżącej władzy wykonawczej i reprezentacji sprawuje samodzielnie Prezes Zarządu, przy zachowaniu jedynie dwóch organów wymaganych ustawowo — Walnego Zebrania Członków (jako najwyższej władzy) i Komisji Rewizyjnej (jako organu kontroli). Pola w nawiasach kwadratowych [...] należy uzupełnić przed uchwaleniem statutu.</w:t>
+        <w:t>Wzór uproszczony — przygotowany na bazie struktury statutu Towarzystwa Miłośników Strzelectwa „Sagittarius” (Gogolin, KRS 0000591210), zgodny z wymogami art. 10 ustawy — Prawo o stowarzyszeniach, a jednocześnie zaprojektowany tak, aby: (1) został bezproblemowo przyjęty niezależnie od wybranej ścieżki rejestracji — Krajowego Rejestru Sądowego (KRS) albo uproszczonej ewidencji starosty — oraz uzyskał licencję klubową PZSS, (2) nadał Stowarzyszeniu wyraźny charakter kolekcjonerski, dzięki czemu udokumentowane członkostwo w nim stanowi samodzielną, ustawową podstawę do uzyskania przez członka pozwolenia na broń do celów kolekcjonerskich (WPA), (3) maksymalnie uprościł zarządzanie i zapewnił Prezesowi Zarządu pełnię bieżącej władzy wykonawczej i wyłączną reprezentację, przy zachowaniu jedynie dwóch organów wymaganych ustawowo — Walnego Zebrania Członków (jako najwyższej władzy) i Komisji Rewizyjnej (jako organu kontroli), oraz (4) maksymalnie ograniczył możliwość zmiany na funkcji Prezesa Zarządu wbrew jego woli — odwołanie wymaga kwalifikowanej większości głosów całego składu członkowskiego, a nie tylko osób obecnych na zebraniu, a ochrony tej nie można obejść poprzez zwykłą zmianę statutu (§ 20 ust. 7–9). Pola w nawiasach kwadratowych [...] należy uzupełnić przed uchwaleniem statutu.</w:t>
       </w:r>
     </w:p>
     <w:p>
@@ -1655,23 +1655,39 @@
         <w:ind w:left="340"/>
       </w:pPr>
       <w:r>
-        <w:t>•  Tryb uproszczony (zalecany przez ten wzór): ponieważ § 11 statutu wprost wyłącza prowadzenie działalności gospodarczej, Stowarzyszenie kwalifikuje się do wpisu do ewidencji klubów sportowych prowadzonej przez starostę właściwego dla siedziby klubu (art. 4 ust. 7 w zw. z ust. 2 i 4–6 ustawy o sporcie) — zamiast pełnej rejestracji w KRS. Ta ścieżka jest szybsza i tańsza (opłata skarbowa ok. 10 zł, decyzja w ciągu 30 dni, a brak decyzji w tym terminie oznacza automatyczne „milczące” załatwienie wniosku na korzyść klubu), a do wniosku o wpis dołącza się statut, listę założycieli, protokół zebrania założycielskiego oraz uchwały o powołaniu klubu, przyjęciu statutu i wyborze Prezesa Zarządu i Komisji Rewizyjnej. PZSS honoruje taki wpis na równi z KRS — regulamin licencyjny dopuszcza „wypis z KRS lub innego rejestru albo ewidencji”.</w:t>
+        <w:t>•  Ten sam tekst statutu nadaje się do obu równoważnych ścieżek rejestracji — zmienia się tylko organ, do którego składa się wniosek:</w:t>
       </w:r>
     </w:p>
     <w:p>
       <w:pPr>
-        <w:ind w:left="340"/>
+        <w:ind w:left="680"/>
       </w:pPr>
       <w:r>
-        <w:t>•  Alternatywnie Stowarzyszenie może zostać zarejestrowane na zasadach ogólnych w KRS (również bezpłatnie, skoro statut nie przewiduje działalności gospodarczej) — ten sam tekst statutu nadaje się do obu ścieżek, zmienia się tylko organ, do którego składa się wniosek.</w:t>
+        <w:t>1. Krajowy Rejestr Sądowy (KRS) — rejestracja na zasadach ogólnych, bezpłatna, skoro statut (§ 11) nie przewiduje działalności gospodarczej. Postępowanie trwa z reguły dłużej niż w ewidencji starosty (zwykle kilka tygodni, czasem z wezwaniami sądu do uzupełnienia braków formalnych — stąd kompletność statutu wobec art. 10 ust. 1 ustawy jest tu szczególnie istotna), ale wpis do KRS jest najszerzej rozpoznawanym potwierdzeniem osobowości prawnej — przyjmowanym bez dodatkowych wyjaśnień przez banki, urzędy, PZSS oraz Policję (WPA) przy wniosku o pozwolenie na broń.</w:t>
       </w:r>
     </w:p>
     <w:p>
       <w:pPr>
+        <w:ind w:left="680"/>
+      </w:pPr>
+      <w:r>
+        <w:t>2. Ewidencja klubów sportowych prowadzona przez starostę (art. 4 ust. 7 w zw. z ust. 2 i 4–6 ustawy o sporcie) — szybsza i tańsza (opłata skarbowa ok. 10 zł, decyzja w ciągu 30 dni, a brak decyzji w tym terminie oznacza automatyczne „milczące” załatwienie wniosku na korzyść klubu); do wniosku o wpis dołącza się statut, listę założycieli, protokół zebrania założycielskiego oraz uchwały o powołaniu klubu, przyjęciu statutu i wyborze Prezesa Zarządu i Komisji Rewizyjnej. PZSS honoruje taki wpis na równi z KRS — regulamin licencyjny dopuszcza „wypis z KRS lub innego rejestru albo ewidencji”.</w:t>
+      </w:r>
+    </w:p>
+    <w:p>
+      <w:pPr>
         <w:ind w:left="340"/>
       </w:pPr>
       <w:r>
-        <w:t>•  Jeżeli w przyszłości okaże się, że Stowarzyszenie jednak potrzebuje prowadzić działalność gospodarczą (np. odpłatny wynajem własnej strzelnicy na większą skalę), § 11 trzeba będzie zmienić, a samo Stowarzyszenie przerejestrować z ewidencji starosty do KRS — to więcej formalności niż przy wyborze KRS od początku, więc warto to rozważyć już na etapie zakładania klubu.</w:t>
+        <w:t>•  Statut zawiera wszystkie elementy obowiązkowe z art. 10 ust. 1 Prawa o stowarzyszeniach (patrz wyżej), więc niezależnie od wybranej ścieżki organ rejestrowy nie powinien mieć podstaw do wezwania o uzupełnienie braków formalnych.</w:t>
+      </w:r>
+    </w:p>
+    <w:p>
+      <w:pPr>
+        <w:ind w:left="340"/>
+      </w:pPr>
+      <w:r>
+        <w:t>•  Jeżeli w przyszłości okaże się, że Stowarzyszenie jednak potrzebuje prowadzić działalność gospodarczą (np. odpłatny wynajem własnej strzelnicy na większą skalę), § 11 trzeba będzie zmienić, a Stowarzyszenie zarejestrowane w ewidencji starosty — przerejestrować do KRS; przy rejestracji od razu w KRS tego dodatkowego kroku unika się w ogóle.</w:t>
       </w:r>
     </w:p>
     <w:p>

</xml_diff>